<commit_message>
Address PR findings: CI credential hardening, audited deps, pinned install docs
</commit_message>
<xml_diff>
--- a/dnsfcli/docs/dnsfcli-reference.docx
+++ b/dnsfcli/docs/dnsfcli-reference.docx
@@ -805,7 +805,9 @@
                 <w:color w:val="FFFFFF"/>
                 <w:sz w:val="22"/>
               </w:rPr>
-              <w:t>pip install "git+https://github.com/DNSFilter/support.git#subdirectory=dnsfcli"</w:t>
+              <w:t>pip install "git+https://github.com/DNSFilter/support.git@dnsfcli-v0.1.0#subdirectory=dnsfcli"</w:t>
+              <w:br/>
+              <w:t># (drop @dnsfcli-v0.1.0 to track the latest development version)</w:t>
               <w:br/>
               <w:t># or, from a local clone:</w:t>
               <w:br/>

</xml_diff>